<commit_message>
Auto sync 20251112 153610
</commit_message>
<xml_diff>
--- a/Технологии проектирования и разработки информационных систем/Отчеты/Отчет по лабораторной 5.docx
+++ b/Технологии проектирования и разработки информационных систем/Отчеты/Отчет по лабораторной 5.docx
@@ -1076,6 +1076,18 @@
           <w:tab w:val="left" w:pos="993"/>
         </w:tabs>
         <w:spacing w:line="360" w:lineRule="auto"/>
+        <w:jc w:val="center"/>
+      </w:pPr>
+      <w:r>
+        <w:t>Рисунок 1 – Схема модели бизнес-процесса</w:t>
+      </w:r>
+    </w:p>
+    <w:p>
+      <w:pPr>
+        <w:tabs>
+          <w:tab w:val="left" w:pos="993"/>
+        </w:tabs>
+        <w:spacing w:line="360" w:lineRule="auto"/>
         <w:ind w:firstLine="709"/>
         <w:jc w:val="both"/>
         <w:rPr>
@@ -1260,6 +1272,7 @@
         <w:jc w:val="both"/>
       </w:pPr>
       <w:r>
+        <w:lastRenderedPageBreak/>
         <w:t>Проверка состояния возвращаемой книги.</w:t>
       </w:r>
     </w:p>
@@ -1277,7 +1290,6 @@
         <w:jc w:val="both"/>
       </w:pPr>
       <w:r>
-        <w:lastRenderedPageBreak/>
         <w:t>Регистрация возврата книги в системе.</w:t>
       </w:r>
     </w:p>
@@ -1720,6 +1732,7 @@
           <w:szCs w:val="24"/>
         </w:rPr>
       </w:pPr>
+      <w:proofErr w:type="spellStart"/>
       <w:r>
         <w:rPr>
           <w:b/>
@@ -1729,6 +1742,7 @@
         </w:rPr>
         <w:t>Бухгалтерия</w:t>
       </w:r>
+      <w:proofErr w:type="spellEnd"/>
     </w:p>
     <w:p>
       <w:pPr>
@@ -1835,6 +1849,7 @@
           <w:szCs w:val="24"/>
         </w:rPr>
       </w:pPr>
+      <w:proofErr w:type="spellStart"/>
       <w:r>
         <w:rPr>
           <w:b/>
@@ -1844,6 +1859,7 @@
         </w:rPr>
         <w:t>Управление</w:t>
       </w:r>
+      <w:proofErr w:type="spellEnd"/>
     </w:p>
     <w:p>
       <w:pPr>
@@ -1876,6 +1892,7 @@
         <w:jc w:val="both"/>
       </w:pPr>
       <w:r>
+        <w:lastRenderedPageBreak/>
         <w:t>Координация деятельности всех подразделений.</w:t>
       </w:r>
     </w:p>
@@ -1893,7 +1910,6 @@
         <w:jc w:val="both"/>
       </w:pPr>
       <w:r>
-        <w:lastRenderedPageBreak/>
         <w:t>Управление персоналом (подбор, обучение, мотивация).</w:t>
       </w:r>
     </w:p>
@@ -2536,7 +2552,15 @@
         <w:jc w:val="both"/>
       </w:pPr>
       <w:r>
-        <w:t>R (Responsible) — выполняет работу.</w:t>
+        <w:t>R (</w:t>
+      </w:r>
+      <w:proofErr w:type="spellStart"/>
+      <w:r>
+        <w:t>Responsible</w:t>
+      </w:r>
+      <w:proofErr w:type="spellEnd"/>
+      <w:r>
+        <w:t>) — выполняет работу.</w:t>
       </w:r>
     </w:p>
     <w:p>
@@ -2553,7 +2577,15 @@
         <w:jc w:val="both"/>
       </w:pPr>
       <w:r>
-        <w:t>A (Accountable) — отвечает за результат.</w:t>
+        <w:t>A (</w:t>
+      </w:r>
+      <w:proofErr w:type="spellStart"/>
+      <w:r>
+        <w:t>Accountable</w:t>
+      </w:r>
+      <w:proofErr w:type="spellEnd"/>
+      <w:r>
+        <w:t>) — отвечает за результат.</w:t>
       </w:r>
     </w:p>
     <w:p>
@@ -2570,7 +2602,15 @@
         <w:jc w:val="both"/>
       </w:pPr>
       <w:r>
-        <w:t>C (Consulted) — консультируется, участвует в обсуждениях.</w:t>
+        <w:t>C (</w:t>
+      </w:r>
+      <w:proofErr w:type="spellStart"/>
+      <w:r>
+        <w:t>Consulted</w:t>
+      </w:r>
+      <w:proofErr w:type="spellEnd"/>
+      <w:r>
+        <w:t>) — консультируется, участвует в обсуждениях.</w:t>
       </w:r>
     </w:p>
     <w:p>
@@ -2587,7 +2627,15 @@
         <w:jc w:val="both"/>
       </w:pPr>
       <w:r>
-        <w:t>I (Informed) — информируется о результатах.</w:t>
+        <w:t>I (</w:t>
+      </w:r>
+      <w:proofErr w:type="spellStart"/>
+      <w:r>
+        <w:t>Informed</w:t>
+      </w:r>
+      <w:proofErr w:type="spellEnd"/>
+      <w:r>
+        <w:t>) — информируется о результатах.</w:t>
       </w:r>
     </w:p>
     <w:p>
@@ -2604,7 +2652,15 @@
         <w:jc w:val="both"/>
       </w:pPr>
       <w:r>
-        <w:t>S (Support) — оказывает поддержку.</w:t>
+        <w:t>S (</w:t>
+      </w:r>
+      <w:proofErr w:type="spellStart"/>
+      <w:r>
+        <w:t>Support</w:t>
+      </w:r>
+      <w:proofErr w:type="spellEnd"/>
+      <w:r>
+        <w:t>) — оказывает поддержку.</w:t>
       </w:r>
     </w:p>
     <w:p>
@@ -2726,7 +2782,6 @@
         <w:jc w:val="both"/>
       </w:pPr>
       <w:r>
-        <w:lastRenderedPageBreak/>
         <w:t>Таблица 2 – Матрица ответственности</w:t>
       </w:r>
     </w:p>
@@ -3062,6 +3117,7 @@
                 <w:szCs w:val="20"/>
               </w:rPr>
             </w:pPr>
+            <w:proofErr w:type="gramStart"/>
             <w:r>
               <w:rPr>
                 <w:spacing w:val="2"/>
@@ -3070,6 +3126,7 @@
               </w:rPr>
               <w:t>R,A</w:t>
             </w:r>
+            <w:proofErr w:type="gramEnd"/>
           </w:p>
         </w:tc>
         <w:tc>
@@ -3278,6 +3335,7 @@
                 <w:szCs w:val="20"/>
               </w:rPr>
             </w:pPr>
+            <w:proofErr w:type="gramStart"/>
             <w:r>
               <w:rPr>
                 <w:spacing w:val="2"/>
@@ -3286,6 +3344,7 @@
               </w:rPr>
               <w:t>R,A</w:t>
             </w:r>
+            <w:proofErr w:type="gramEnd"/>
           </w:p>
         </w:tc>
         <w:tc>
@@ -3486,6 +3545,7 @@
                 <w:szCs w:val="20"/>
               </w:rPr>
             </w:pPr>
+            <w:proofErr w:type="gramStart"/>
             <w:r>
               <w:rPr>
                 <w:spacing w:val="2"/>
@@ -3494,6 +3554,7 @@
               </w:rPr>
               <w:t>R,A</w:t>
             </w:r>
+            <w:proofErr w:type="gramEnd"/>
           </w:p>
         </w:tc>
         <w:tc>
@@ -3677,6 +3738,7 @@
                 <w:szCs w:val="20"/>
               </w:rPr>
             </w:pPr>
+            <w:proofErr w:type="gramStart"/>
             <w:r>
               <w:rPr>
                 <w:spacing w:val="2"/>
@@ -3685,6 +3747,7 @@
               </w:rPr>
               <w:t>R,A</w:t>
             </w:r>
+            <w:proofErr w:type="gramEnd"/>
           </w:p>
         </w:tc>
         <w:tc>
@@ -3868,6 +3931,7 @@
                 <w:szCs w:val="20"/>
               </w:rPr>
             </w:pPr>
+            <w:proofErr w:type="gramStart"/>
             <w:r>
               <w:rPr>
                 <w:spacing w:val="2"/>
@@ -3876,6 +3940,7 @@
               </w:rPr>
               <w:t>R,A</w:t>
             </w:r>
+            <w:proofErr w:type="gramEnd"/>
           </w:p>
         </w:tc>
         <w:tc>
@@ -4102,6 +4167,7 @@
                 <w:szCs w:val="20"/>
               </w:rPr>
             </w:pPr>
+            <w:proofErr w:type="gramStart"/>
             <w:r>
               <w:rPr>
                 <w:spacing w:val="2"/>
@@ -4110,6 +4176,7 @@
               </w:rPr>
               <w:t>R,A</w:t>
             </w:r>
+            <w:proofErr w:type="gramEnd"/>
           </w:p>
         </w:tc>
         <w:tc>
@@ -4196,8 +4263,6 @@
       <w:r>
         <w:t>Таблица 3 – Штатное расписание</w:t>
       </w:r>
-      <w:bookmarkStart w:id="0" w:name="_GoBack"/>
-      <w:bookmarkEnd w:id="0"/>
     </w:p>
     <w:tbl>
       <w:tblPr>
@@ -4998,414 +5063,37 @@
           <w:b/>
           <w:bCs/>
         </w:rPr>
-        <w:t>4. Требования к системе</w:t>
-      </w:r>
-    </w:p>
-    <w:p>
-      <w:pPr>
-        <w:tabs>
-          <w:tab w:val="left" w:pos="993"/>
-        </w:tabs>
-        <w:spacing w:line="360" w:lineRule="auto"/>
-        <w:ind w:firstLine="709"/>
-        <w:jc w:val="both"/>
-      </w:pPr>
-      <w:r>
-        <w:t>4.1 Функциональные требования</w:t>
-      </w:r>
-    </w:p>
-    <w:p>
-      <w:pPr>
-        <w:pStyle w:val="a5"/>
-        <w:numPr>
-          <w:ilvl w:val="0"/>
-          <w:numId w:val="1"/>
-        </w:numPr>
-        <w:tabs>
-          <w:tab w:val="left" w:pos="993"/>
-        </w:tabs>
-        <w:spacing w:line="360" w:lineRule="auto"/>
-        <w:ind w:left="0" w:firstLine="709"/>
-        <w:jc w:val="both"/>
-        <w:rPr>
-          <w:sz w:val="24"/>
-          <w:szCs w:val="24"/>
-          <w:lang w:val="ru-RU"/>
-        </w:rPr>
-      </w:pPr>
-      <w:r>
-        <w:rPr>
-          <w:sz w:val="24"/>
-          <w:szCs w:val="24"/>
-          <w:lang w:val="ru-RU"/>
-        </w:rPr>
-        <w:t>Регистрация и каталогизация всех новых книг с уникальными инвентарными номерами.</w:t>
-      </w:r>
-    </w:p>
-    <w:p>
-      <w:pPr>
-        <w:pStyle w:val="a5"/>
-        <w:numPr>
-          <w:ilvl w:val="0"/>
-          <w:numId w:val="1"/>
-        </w:numPr>
-        <w:tabs>
-          <w:tab w:val="left" w:pos="993"/>
-        </w:tabs>
-        <w:spacing w:line="360" w:lineRule="auto"/>
-        <w:ind w:left="0" w:firstLine="709"/>
-        <w:jc w:val="both"/>
-        <w:rPr>
-          <w:sz w:val="24"/>
-          <w:szCs w:val="24"/>
-          <w:lang w:val="ru-RU"/>
-        </w:rPr>
-      </w:pPr>
-      <w:r>
-        <w:rPr>
-          <w:sz w:val="24"/>
-          <w:szCs w:val="24"/>
-          <w:lang w:val="ru-RU"/>
-        </w:rPr>
-        <w:t>Поиск и фильтрация книг по параметрам: автор, название, тематическая категория, год издания и др.</w:t>
-      </w:r>
-    </w:p>
-    <w:p>
-      <w:pPr>
-        <w:pStyle w:val="a5"/>
-        <w:numPr>
-          <w:ilvl w:val="0"/>
-          <w:numId w:val="1"/>
-        </w:numPr>
-        <w:tabs>
-          <w:tab w:val="left" w:pos="993"/>
-        </w:tabs>
-        <w:spacing w:line="360" w:lineRule="auto"/>
-        <w:ind w:left="0" w:firstLine="709"/>
-        <w:jc w:val="both"/>
-        <w:rPr>
-          <w:sz w:val="24"/>
-          <w:szCs w:val="24"/>
-          <w:lang w:val="ru-RU"/>
-        </w:rPr>
-      </w:pPr>
-      <w:r>
-        <w:rPr>
-          <w:sz w:val="24"/>
-          <w:szCs w:val="24"/>
-          <w:lang w:val="ru-RU"/>
-        </w:rPr>
-        <w:t>Учет операций выдачи и возврата книг с фиксацией данных о читателях и сроках возврата.</w:t>
-      </w:r>
-    </w:p>
-    <w:p>
-      <w:pPr>
-        <w:pStyle w:val="a5"/>
-        <w:numPr>
-          <w:ilvl w:val="0"/>
-          <w:numId w:val="1"/>
-        </w:numPr>
-        <w:tabs>
-          <w:tab w:val="left" w:pos="993"/>
-        </w:tabs>
-        <w:spacing w:line="360" w:lineRule="auto"/>
-        <w:ind w:left="0" w:firstLine="709"/>
-        <w:jc w:val="both"/>
-        <w:rPr>
-          <w:sz w:val="24"/>
-          <w:szCs w:val="24"/>
-          <w:lang w:val="ru-RU"/>
-        </w:rPr>
-      </w:pPr>
-      <w:r>
-        <w:rPr>
-          <w:sz w:val="24"/>
-          <w:szCs w:val="24"/>
-          <w:lang w:val="ru-RU"/>
-        </w:rPr>
-        <w:t>Формирование отчетов о состоянии фонда, движении книг, списаниях.</w:t>
-      </w:r>
-    </w:p>
-    <w:p>
-      <w:pPr>
-        <w:pStyle w:val="a5"/>
-        <w:numPr>
-          <w:ilvl w:val="0"/>
-          <w:numId w:val="1"/>
-        </w:numPr>
-        <w:tabs>
-          <w:tab w:val="left" w:pos="993"/>
-        </w:tabs>
-        <w:spacing w:line="360" w:lineRule="auto"/>
-        <w:ind w:left="0" w:firstLine="709"/>
-        <w:jc w:val="both"/>
-        <w:rPr>
-          <w:sz w:val="24"/>
-          <w:szCs w:val="24"/>
-          <w:lang w:val="ru-RU"/>
-        </w:rPr>
-      </w:pPr>
-      <w:r>
-        <w:rPr>
-          <w:sz w:val="24"/>
-          <w:szCs w:val="24"/>
-          <w:lang w:val="ru-RU"/>
-        </w:rPr>
-        <w:t>Управление пользователями и правами доступа.</w:t>
-      </w:r>
-    </w:p>
-    <w:p>
-      <w:pPr>
-        <w:tabs>
-          <w:tab w:val="left" w:pos="993"/>
-        </w:tabs>
-        <w:spacing w:line="360" w:lineRule="auto"/>
-        <w:ind w:firstLine="709"/>
-        <w:jc w:val="both"/>
-      </w:pPr>
-      <w:r>
-        <w:t>4.2 Нефункциональные требования</w:t>
-      </w:r>
-    </w:p>
-    <w:p>
-      <w:pPr>
-        <w:pStyle w:val="a5"/>
-        <w:numPr>
-          <w:ilvl w:val="0"/>
-          <w:numId w:val="1"/>
-        </w:numPr>
-        <w:tabs>
-          <w:tab w:val="left" w:pos="993"/>
-        </w:tabs>
-        <w:spacing w:line="360" w:lineRule="auto"/>
-        <w:ind w:left="0" w:firstLine="709"/>
-        <w:jc w:val="both"/>
-        <w:rPr>
-          <w:sz w:val="24"/>
-          <w:szCs w:val="24"/>
-          <w:lang w:val="ru-RU"/>
-        </w:rPr>
-      </w:pPr>
-      <w:r>
-        <w:rPr>
-          <w:sz w:val="24"/>
-          <w:szCs w:val="24"/>
-          <w:lang w:val="ru-RU"/>
-        </w:rPr>
-        <w:lastRenderedPageBreak/>
-        <w:t>Система должна обеспечивать одновременную работу не менее 20 пользователей.</w:t>
-      </w:r>
-    </w:p>
-    <w:p>
-      <w:pPr>
-        <w:pStyle w:val="a5"/>
-        <w:numPr>
-          <w:ilvl w:val="0"/>
-          <w:numId w:val="1"/>
-        </w:numPr>
-        <w:tabs>
-          <w:tab w:val="left" w:pos="993"/>
-        </w:tabs>
-        <w:spacing w:line="360" w:lineRule="auto"/>
-        <w:ind w:left="0" w:firstLine="709"/>
-        <w:jc w:val="both"/>
-        <w:rPr>
-          <w:sz w:val="24"/>
-          <w:szCs w:val="24"/>
-          <w:lang w:val="ru-RU"/>
-        </w:rPr>
-      </w:pPr>
-      <w:r>
-        <w:rPr>
-          <w:sz w:val="24"/>
-          <w:szCs w:val="24"/>
-          <w:lang w:val="ru-RU"/>
-        </w:rPr>
-        <w:t>Обеспечение высокой доступности и устойчивости к сбоям.</w:t>
-      </w:r>
-    </w:p>
-    <w:p>
-      <w:pPr>
-        <w:pStyle w:val="a5"/>
-        <w:numPr>
-          <w:ilvl w:val="0"/>
-          <w:numId w:val="1"/>
-        </w:numPr>
-        <w:tabs>
-          <w:tab w:val="left" w:pos="993"/>
-        </w:tabs>
-        <w:spacing w:line="360" w:lineRule="auto"/>
-        <w:ind w:left="0" w:firstLine="709"/>
-        <w:jc w:val="both"/>
-        <w:rPr>
-          <w:sz w:val="24"/>
-          <w:szCs w:val="24"/>
-        </w:rPr>
-      </w:pPr>
-      <w:r>
-        <w:rPr>
-          <w:sz w:val="24"/>
-          <w:szCs w:val="24"/>
-        </w:rPr>
-        <w:t>Возможность масштабирования базы данных.</w:t>
-      </w:r>
-    </w:p>
-    <w:p>
-      <w:pPr>
-        <w:tabs>
-          <w:tab w:val="left" w:pos="993"/>
-        </w:tabs>
-        <w:spacing w:line="360" w:lineRule="auto"/>
-        <w:ind w:firstLine="709"/>
-        <w:jc w:val="both"/>
+        <w:t xml:space="preserve">4. </w:t>
+      </w:r>
+      <w:r>
         <w:rPr>
           <w:b/>
           <w:bCs/>
         </w:rPr>
-      </w:pPr>
-      <w:r>
+        <w:t>Структура ПО</w:t>
+      </w:r>
+    </w:p>
+    <w:p>
+      <w:pPr>
+        <w:tabs>
+          <w:tab w:val="left" w:pos="993"/>
+        </w:tabs>
+        <w:spacing w:line="360" w:lineRule="auto"/>
+        <w:ind w:firstLine="709"/>
+        <w:jc w:val="both"/>
         <w:rPr>
           <w:b/>
           <w:bCs/>
         </w:rPr>
-        <w:t>5. Технические требования</w:t>
-      </w:r>
-    </w:p>
-    <w:p>
-      <w:pPr>
-        <w:pStyle w:val="a5"/>
-        <w:numPr>
-          <w:ilvl w:val="0"/>
-          <w:numId w:val="1"/>
-        </w:numPr>
-        <w:tabs>
-          <w:tab w:val="left" w:pos="993"/>
-        </w:tabs>
-        <w:spacing w:line="360" w:lineRule="auto"/>
-        <w:ind w:left="0" w:firstLine="709"/>
-        <w:jc w:val="both"/>
-        <w:rPr>
-          <w:sz w:val="24"/>
-          <w:szCs w:val="24"/>
-          <w:lang w:val="ru-RU"/>
-        </w:rPr>
-      </w:pPr>
-      <w:r>
-        <w:rPr>
-          <w:sz w:val="24"/>
-          <w:szCs w:val="24"/>
-          <w:lang w:val="ru-RU"/>
-        </w:rPr>
-        <w:t>Серверное приложение и база данных работают на оборудовании заказчика.</w:t>
-      </w:r>
-    </w:p>
-    <w:p>
-      <w:pPr>
-        <w:pStyle w:val="a5"/>
-        <w:numPr>
-          <w:ilvl w:val="0"/>
-          <w:numId w:val="1"/>
-        </w:numPr>
-        <w:tabs>
-          <w:tab w:val="left" w:pos="993"/>
-        </w:tabs>
-        <w:spacing w:line="360" w:lineRule="auto"/>
-        <w:ind w:left="0" w:firstLine="709"/>
-        <w:jc w:val="both"/>
-        <w:rPr>
-          <w:sz w:val="24"/>
-          <w:szCs w:val="24"/>
-          <w:lang w:val="ru-RU"/>
-        </w:rPr>
-      </w:pPr>
-      <w:r>
-        <w:rPr>
-          <w:sz w:val="24"/>
-          <w:szCs w:val="24"/>
-          <w:lang w:val="ru-RU"/>
-        </w:rPr>
-        <w:t xml:space="preserve">Используемая СУБД: </w:t>
-      </w:r>
-      <w:r>
-        <w:rPr>
-          <w:sz w:val="24"/>
-          <w:szCs w:val="24"/>
-        </w:rPr>
-        <w:t>PostgreSQL</w:t>
-      </w:r>
-      <w:r>
-        <w:rPr>
-          <w:sz w:val="24"/>
-          <w:szCs w:val="24"/>
-          <w:lang w:val="ru-RU"/>
-        </w:rPr>
-        <w:t xml:space="preserve"> (или аналог).</w:t>
-      </w:r>
-    </w:p>
-    <w:p>
-      <w:pPr>
-        <w:pStyle w:val="a5"/>
-        <w:numPr>
-          <w:ilvl w:val="0"/>
-          <w:numId w:val="1"/>
-        </w:numPr>
-        <w:tabs>
-          <w:tab w:val="left" w:pos="993"/>
-        </w:tabs>
-        <w:spacing w:line="360" w:lineRule="auto"/>
-        <w:ind w:left="0" w:firstLine="709"/>
-        <w:jc w:val="both"/>
-        <w:rPr>
-          <w:sz w:val="24"/>
-          <w:szCs w:val="24"/>
-          <w:lang w:val="ru-RU"/>
-        </w:rPr>
-      </w:pPr>
-      <w:r>
-        <w:rPr>
-          <w:sz w:val="24"/>
-          <w:szCs w:val="24"/>
-          <w:lang w:val="ru-RU"/>
-        </w:rPr>
-        <w:t>Клиентская часть — веб-приложение, доступное через стандартные браузеры.</w:t>
-      </w:r>
-    </w:p>
-    <w:p>
-      <w:pPr>
-        <w:pStyle w:val="a5"/>
-        <w:numPr>
-          <w:ilvl w:val="0"/>
-          <w:numId w:val="1"/>
-        </w:numPr>
-        <w:tabs>
-          <w:tab w:val="left" w:pos="993"/>
-        </w:tabs>
-        <w:spacing w:line="360" w:lineRule="auto"/>
-        <w:ind w:left="0" w:firstLine="709"/>
-        <w:jc w:val="both"/>
-        <w:rPr>
-          <w:sz w:val="24"/>
-          <w:szCs w:val="24"/>
-          <w:lang w:val="ru-RU"/>
-        </w:rPr>
-      </w:pPr>
-      <w:r>
-        <w:rPr>
-          <w:sz w:val="24"/>
-          <w:szCs w:val="24"/>
-          <w:lang w:val="ru-RU"/>
-        </w:rPr>
-        <w:t>Реализация резервного копирования данных не реже одного раза в сутки.</w:t>
-      </w:r>
-    </w:p>
-    <w:p>
-      <w:pPr>
-        <w:tabs>
-          <w:tab w:val="left" w:pos="993"/>
-        </w:tabs>
-        <w:spacing w:line="360" w:lineRule="auto"/>
-        <w:ind w:firstLine="709"/>
-        <w:jc w:val="both"/>
+      </w:pPr>
+    </w:p>
+    <w:p>
+      <w:pPr>
+        <w:tabs>
+          <w:tab w:val="left" w:pos="993"/>
+        </w:tabs>
+        <w:spacing w:line="360" w:lineRule="auto"/>
+        <w:jc w:val="center"/>
         <w:rPr>
           <w:b/>
           <w:bCs/>
@@ -5415,161 +5103,68 @@
         <w:rPr>
           <w:b/>
           <w:bCs/>
-        </w:rPr>
-        <w:t>6. Требования по безопасности</w:t>
-      </w:r>
-    </w:p>
-    <w:p>
-      <w:pPr>
-        <w:pStyle w:val="a5"/>
-        <w:numPr>
-          <w:ilvl w:val="0"/>
-          <w:numId w:val="1"/>
-        </w:numPr>
-        <w:tabs>
-          <w:tab w:val="left" w:pos="993"/>
-        </w:tabs>
-        <w:spacing w:line="360" w:lineRule="auto"/>
-        <w:ind w:left="0" w:firstLine="709"/>
-        <w:jc w:val="both"/>
-        <w:rPr>
-          <w:sz w:val="24"/>
-          <w:szCs w:val="24"/>
-          <w:lang w:val="ru-RU"/>
-        </w:rPr>
-      </w:pPr>
-      <w:r>
-        <w:rPr>
-          <w:sz w:val="24"/>
-          <w:szCs w:val="24"/>
-          <w:lang w:val="ru-RU"/>
-        </w:rPr>
-        <w:t>Аутентификация пользователей по логину и паролю.</w:t>
-      </w:r>
-    </w:p>
-    <w:p>
-      <w:pPr>
-        <w:pStyle w:val="a5"/>
-        <w:numPr>
-          <w:ilvl w:val="0"/>
-          <w:numId w:val="1"/>
-        </w:numPr>
-        <w:tabs>
-          <w:tab w:val="left" w:pos="993"/>
-        </w:tabs>
-        <w:spacing w:line="360" w:lineRule="auto"/>
-        <w:ind w:left="0" w:firstLine="709"/>
-        <w:jc w:val="both"/>
-        <w:rPr>
-          <w:sz w:val="24"/>
-          <w:szCs w:val="24"/>
-          <w:lang w:val="ru-RU"/>
-        </w:rPr>
-      </w:pPr>
-      <w:r>
-        <w:rPr>
-          <w:sz w:val="24"/>
-          <w:szCs w:val="24"/>
-          <w:lang w:val="ru-RU"/>
-        </w:rPr>
-        <w:t>Авторизация пользователей с разграничением прав по ролям (администратор, библиотекарь, читатель).</w:t>
-      </w:r>
-    </w:p>
-    <w:p>
-      <w:pPr>
-        <w:pStyle w:val="a5"/>
-        <w:numPr>
-          <w:ilvl w:val="0"/>
-          <w:numId w:val="1"/>
-        </w:numPr>
-        <w:tabs>
-          <w:tab w:val="left" w:pos="993"/>
-        </w:tabs>
-        <w:spacing w:line="360" w:lineRule="auto"/>
-        <w:ind w:left="0" w:firstLine="709"/>
-        <w:jc w:val="both"/>
-        <w:rPr>
-          <w:sz w:val="24"/>
-          <w:szCs w:val="24"/>
-          <w:lang w:val="ru-RU"/>
-        </w:rPr>
-      </w:pPr>
-      <w:r>
-        <w:rPr>
-          <w:sz w:val="24"/>
-          <w:szCs w:val="24"/>
-          <w:lang w:val="ru-RU"/>
-        </w:rPr>
-        <w:t xml:space="preserve">Использование защищенного протокола передачи данных </w:t>
-      </w:r>
-      <w:r>
-        <w:rPr>
-          <w:sz w:val="24"/>
-          <w:szCs w:val="24"/>
-        </w:rPr>
-        <w:t>HTTPS</w:t>
-      </w:r>
-      <w:r>
-        <w:rPr>
-          <w:sz w:val="24"/>
-          <w:szCs w:val="24"/>
-          <w:lang w:val="ru-RU"/>
-        </w:rPr>
-        <w:t>.</w:t>
-      </w:r>
-    </w:p>
-    <w:p>
-      <w:pPr>
-        <w:pStyle w:val="a5"/>
-        <w:numPr>
-          <w:ilvl w:val="0"/>
-          <w:numId w:val="1"/>
-        </w:numPr>
-        <w:tabs>
-          <w:tab w:val="left" w:pos="993"/>
-        </w:tabs>
-        <w:spacing w:line="360" w:lineRule="auto"/>
-        <w:ind w:left="0" w:firstLine="709"/>
-        <w:jc w:val="both"/>
-        <w:rPr>
-          <w:sz w:val="24"/>
-          <w:szCs w:val="24"/>
-          <w:lang w:val="ru-RU"/>
-        </w:rPr>
-      </w:pPr>
-      <w:r>
-        <w:rPr>
-          <w:sz w:val="24"/>
-          <w:szCs w:val="24"/>
-          <w:lang w:val="ru-RU"/>
-        </w:rPr>
-        <w:t>Регулярное автоматическое резервное копирование данных.</w:t>
-      </w:r>
-    </w:p>
-    <w:p>
-      <w:pPr>
-        <w:pStyle w:val="a5"/>
-        <w:numPr>
-          <w:ilvl w:val="0"/>
-          <w:numId w:val="1"/>
-        </w:numPr>
-        <w:tabs>
-          <w:tab w:val="left" w:pos="993"/>
-        </w:tabs>
-        <w:spacing w:line="360" w:lineRule="auto"/>
-        <w:ind w:left="0" w:firstLine="709"/>
-        <w:jc w:val="both"/>
-        <w:rPr>
-          <w:sz w:val="24"/>
-          <w:szCs w:val="24"/>
-        </w:rPr>
-      </w:pPr>
-      <w:r>
-        <w:rPr>
-          <w:sz w:val="24"/>
-          <w:szCs w:val="24"/>
-        </w:rPr>
-        <w:t>Логирование всех операций пользователей.</w:t>
+          <w:noProof/>
+        </w:rPr>
+        <w:drawing>
+          <wp:inline distT="0" distB="0" distL="0" distR="0" wp14:anchorId="23F8E983" wp14:editId="42F095B2">
+            <wp:extent cx="3124200" cy="1778172"/>
+            <wp:effectExtent l="0" t="0" r="0" b="0"/>
+            <wp:docPr id="2" name="Рисунок 2"/>
+            <wp:cNvGraphicFramePr>
+              <a:graphicFrameLocks xmlns:a="http://schemas.openxmlformats.org/drawingml/2006/main" noChangeAspect="1"/>
+            </wp:cNvGraphicFramePr>
+            <a:graphic xmlns:a="http://schemas.openxmlformats.org/drawingml/2006/main">
+              <a:graphicData uri="http://schemas.openxmlformats.org/drawingml/2006/picture">
+                <pic:pic xmlns:pic="http://schemas.openxmlformats.org/drawingml/2006/picture">
+                  <pic:nvPicPr>
+                    <pic:cNvPr id="0" name="Picture 1"/>
+                    <pic:cNvPicPr>
+                      <a:picLocks noChangeAspect="1" noChangeArrowheads="1"/>
+                    </pic:cNvPicPr>
+                  </pic:nvPicPr>
+                  <pic:blipFill>
+                    <a:blip r:embed="rId7">
+                      <a:extLst>
+                        <a:ext uri="{28A0092B-C50C-407E-A947-70E740481C1C}">
+                          <a14:useLocalDpi xmlns:a14="http://schemas.microsoft.com/office/drawing/2010/main" val="0"/>
+                        </a:ext>
+                      </a:extLst>
+                    </a:blip>
+                    <a:srcRect/>
+                    <a:stretch>
+                      <a:fillRect/>
+                    </a:stretch>
+                  </pic:blipFill>
+                  <pic:spPr bwMode="auto">
+                    <a:xfrm>
+                      <a:off x="0" y="0"/>
+                      <a:ext cx="3148925" cy="1792244"/>
+                    </a:xfrm>
+                    <a:prstGeom prst="rect">
+                      <a:avLst/>
+                    </a:prstGeom>
+                    <a:noFill/>
+                    <a:ln>
+                      <a:noFill/>
+                    </a:ln>
+                  </pic:spPr>
+                </pic:pic>
+              </a:graphicData>
+            </a:graphic>
+          </wp:inline>
+        </w:drawing>
+      </w:r>
+    </w:p>
+    <w:p>
+      <w:pPr>
+        <w:tabs>
+          <w:tab w:val="left" w:pos="993"/>
+        </w:tabs>
+        <w:spacing w:line="360" w:lineRule="auto"/>
+        <w:jc w:val="center"/>
+      </w:pPr>
+      <w:r>
+        <w:t>Рисунок 2 – Обобщённая структура ПО ИС библиотеки</w:t>
       </w:r>
     </w:p>
     <w:p>
@@ -5580,99 +5175,10 @@
         <w:spacing w:line="360" w:lineRule="auto"/>
         <w:ind w:firstLine="709"/>
         <w:jc w:val="both"/>
-        <w:rPr>
-          <w:b/>
-          <w:bCs/>
-        </w:rPr>
-      </w:pPr>
-      <w:r>
-        <w:rPr>
-          <w:b/>
-          <w:bCs/>
-        </w:rPr>
-        <w:t>7. Ввод в эксплуатацию и сопровождение</w:t>
-      </w:r>
-    </w:p>
-    <w:p>
-      <w:pPr>
-        <w:pStyle w:val="a5"/>
-        <w:numPr>
-          <w:ilvl w:val="0"/>
-          <w:numId w:val="1"/>
-        </w:numPr>
-        <w:tabs>
-          <w:tab w:val="left" w:pos="993"/>
-        </w:tabs>
-        <w:spacing w:line="360" w:lineRule="auto"/>
-        <w:ind w:left="0" w:firstLine="709"/>
-        <w:jc w:val="both"/>
-        <w:rPr>
-          <w:sz w:val="24"/>
-          <w:szCs w:val="24"/>
-        </w:rPr>
-      </w:pPr>
-      <w:r>
-        <w:rPr>
-          <w:sz w:val="24"/>
-          <w:szCs w:val="24"/>
-        </w:rPr>
-        <w:t>Проведение тестирования системы заказчиком.</w:t>
-      </w:r>
-    </w:p>
-    <w:p>
-      <w:pPr>
-        <w:pStyle w:val="a5"/>
-        <w:numPr>
-          <w:ilvl w:val="0"/>
-          <w:numId w:val="1"/>
-        </w:numPr>
-        <w:tabs>
-          <w:tab w:val="left" w:pos="993"/>
-        </w:tabs>
-        <w:spacing w:line="360" w:lineRule="auto"/>
-        <w:ind w:left="0" w:firstLine="709"/>
-        <w:jc w:val="both"/>
-        <w:rPr>
-          <w:sz w:val="24"/>
-          <w:szCs w:val="24"/>
-          <w:lang w:val="ru-RU"/>
-        </w:rPr>
-      </w:pPr>
-      <w:r>
-        <w:rPr>
-          <w:sz w:val="24"/>
-          <w:szCs w:val="24"/>
-          <w:lang w:val="ru-RU"/>
-        </w:rPr>
-        <w:t>Обучение персонала работе с системой.</w:t>
-      </w:r>
-    </w:p>
-    <w:p>
-      <w:pPr>
-        <w:pStyle w:val="a5"/>
-        <w:numPr>
-          <w:ilvl w:val="0"/>
-          <w:numId w:val="1"/>
-        </w:numPr>
-        <w:tabs>
-          <w:tab w:val="left" w:pos="993"/>
-        </w:tabs>
-        <w:spacing w:line="360" w:lineRule="auto"/>
-        <w:ind w:left="0" w:firstLine="709"/>
-        <w:jc w:val="both"/>
-        <w:rPr>
-          <w:sz w:val="24"/>
-          <w:szCs w:val="24"/>
-          <w:lang w:val="ru-RU"/>
-        </w:rPr>
-      </w:pPr>
-      <w:r>
-        <w:rPr>
-          <w:sz w:val="24"/>
-          <w:szCs w:val="24"/>
-          <w:lang w:val="ru-RU"/>
-        </w:rPr>
-        <w:t>Организация технической поддержки и обновлений.</w:t>
+      </w:pPr>
+      <w:r>
+        <w:lastRenderedPageBreak/>
+        <w:t>В целях автоматизации процесса управления ресурсами библиотеки предлагается автоматизировать работу Библиотекаря. Для эффективного управления системой также предлагается внедрить АРМ «Управление», для контроля ресурсов библиотеки и работы Библиотекаря. Оба АРМ имеют доступ к СУБД, который настроен определенными ограничениями доступа, для обеспечения безопасности и надежности системы.</w:t>
       </w:r>
     </w:p>
     <w:p>
@@ -5684,6 +5190,8 @@
         <w:ind w:firstLine="709"/>
         <w:jc w:val="both"/>
       </w:pPr>
+      <w:bookmarkStart w:id="0" w:name="_GoBack"/>
+      <w:bookmarkEnd w:id="0"/>
     </w:p>
     <w:sectPr>
       <w:pgSz w:w="11460" w:h="16320"/>
@@ -7751,6 +7259,7 @@
   <w:style w:type="character" w:default="1" w:styleId="a0">
     <w:name w:val="Default Paragraph Font"/>
     <w:uiPriority w:val="1"/>
+    <w:semiHidden/>
     <w:unhideWhenUsed/>
   </w:style>
   <w:style w:type="table" w:default="1" w:styleId="a1">
@@ -8261,7 +7770,7 @@
 </file>
 
 <file path=customXml/itemProps1.xml><?xml version="1.0" encoding="utf-8"?>
-<ds:datastoreItem xmlns:ds="http://schemas.openxmlformats.org/officeDocument/2006/customXml" ds:itemID="{17FF000C-57B3-43DC-B7CA-8D19E369EFEA}">
+<ds:datastoreItem xmlns:ds="http://schemas.openxmlformats.org/officeDocument/2006/customXml" ds:itemID="{86B51707-48F7-4B26-A58E-63B265C95A8F}">
   <ds:schemaRefs>
     <ds:schemaRef ds:uri="http://schemas.openxmlformats.org/officeDocument/2006/bibliography"/>
   </ds:schemaRefs>

</xml_diff>